<commit_message>
fix: result scroll-to-top, lead error surfacing, docs compliance, new template
Functional:
- ResultScreen: add useEffect scroll-to-top on mount (window.scrollTo instant)
- LeadGateModal: surface truncated raw Supabase error in UI for operator diagnosis
  while keeping user-facing message simple; log full error to console

Documents:
- All 5 existing DOCX: replace "Nomad Impact ASBL" header with "marchépublic.be"
  and "document de travail à adapter"; add compliance warning block at top of
  each doc; strengthen footer disclaimer with official sources list
- New doc 6: template-demande-de-prix.docx — structured template for informal
  price requests (sections A–F: org identity, need description, criteria,
  comparison grid, justification, checklist); clearly labeled as working aid,
  not legal advice, with official source references
- Wire template_prix into DOCS map and recommendDocs (shown to all users)

Co-Authored-By: Claude <noreply@anthropic.com>
</commit_message>
<xml_diff>
--- a/public/resources/acheter-sous-30000.docx
+++ b/public/resources/acheter-sous-30000.docx
@@ -19,7 +19,7 @@
           <w:color w:val="5E6B7D"/>
           <w:sz w:val="18"/>
         </w:rPr>
-        <w:t xml:space="preserve">  ·  Fiche pratique — Nomad Impact ASBL</w:t>
+        <w:t xml:space="preserve">  ·  Ressource pratique — document de travail à adapter</w:t>
       </w:r>
     </w:p>
     <w:p>
@@ -32,7 +32,22 @@
     </w:p>
     <w:p>
       <w:pPr>
-        <w:spacing w:before="200" w:after="80"/>
+        <w:spacing w:before="120" w:after="200"/>
+      </w:pPr>
+      <w:r>
+        <w:rPr>
+          <w:i/>
+          <w:color w:val="8B5010"/>
+          <w:sz w:val="17"/>
+        </w:rPr>
+        <w:t>⚠  DOCUMENT DE TRAVAIL — À ADAPTER À VOTRE CONTEXTE</w:t>
+        <w:br/>
+        <w:t>Ce document est une aide pratique éducative. Il ne constitue pas un avis juridique et ne garantit pas la conformité légale de votre procédure. Avant tout usage dans une procédure réelle, faites-le valider par une personne compétente en marchés publics (juriste, conseiller juridique, bailleur de fonds). marchépublic.be est un outil indépendant — non affilié à une autorité publique belge.</w:t>
+      </w:r>
+    </w:p>
+    <w:p>
+      <w:pPr>
+        <w:spacing w:before="80" w:after="80"/>
       </w:pPr>
       <w:r>
         <w:rPr>
@@ -711,9 +726,11 @@
         <w:rPr>
           <w:i/>
           <w:color w:val="5E6B7D"/>
-          <w:sz w:val="17"/>
+          <w:sz w:val="16"/>
         </w:rPr>
-        <w:t>⚠  Avertissement : Ce document est fourni à titre pédagogique uniquement. Il ne constitue pas un avis juridique. Pour toute situation engageante, consultez un·e juriste ou un service compétent en marchés publics. marchépublic.be est un outil indépendant de Nomad Impact ASBL — non affilié à une autorité publique.</w:t>
+        <w:t>⚠  Avertissement — Ce document est fourni à titre éducatif et pratique uniquement. Il ne constitue pas un avis juridique. Il ne garantit pas la conformité de votre procédure avec la législation applicable. Adaptez-le impérativement à votre contexte avant tout usage réel. À faire valider par une personne compétente avant usage dans une procédure réelle. marchépublic.be est un outil indépendant — non affilié à une autorité publique belge.</w:t>
+        <w:br/>
+        <w:t>Sources officielles à consulter : BOSA (bosa.belgium.be) · e-Procurement (publicprocurement.be) · SPF Économie (economie.fgov.be) · Marchés publics Wallonie (marchespublics.wallonie.be) · Règlement général UE 2016/679 (RGPD) pour les données personnelles.</w:t>
       </w:r>
     </w:p>
     <w:sectPr>

</xml_diff>